<commit_message>
Embed 7 generated figures into thermal-modelling manuscript docx; add figure generator
</commit_message>
<xml_diff>
--- a/Manuscript_Thermal_Modelling_ToolChip_Temperature.docx
+++ b/Manuscript_Thermal_Modelling_ToolChip_Temperature.docx
@@ -264,11 +264,46 @@
     </w:p>
     <w:p/>
     <w:p>
-      <w:r>
-        <w:rPr>
-          <w:b/>
-        </w:rPr>
-        <w:t xml:space="preserve">[Figure 1 near here.]</w:t>
+      <w:pPr>
+        <w:jc w:val="center"/>
+        <w:spacing w:before="120" w:after="60"/>
+      </w:pPr>
+      <w:r>
+        <w:drawing>
+          <wp:inline xmlns:wp="http://schemas.openxmlformats.org/drawingml/2006/wordprocessingDrawing" distT="0" distB="0" distL="0" distR="0">
+            <wp:extent cx="5760720" cy="3064212"/>
+            <wp:effectExtent l="0" t="0" r="0" b="0"/>
+            <wp:docPr id="1001" name="Figure1"/>
+            <wp:cNvGraphicFramePr>
+              <a:graphicFrameLocks xmlns:a="http://schemas.openxmlformats.org/drawingml/2006/main" noChangeAspect="1"/>
+            </wp:cNvGraphicFramePr>
+            <a:graphic xmlns:a="http://schemas.openxmlformats.org/drawingml/2006/main">
+              <a:graphicData uri="http://schemas.openxmlformats.org/drawingml/2006/picture">
+                <pic:pic xmlns:pic="http://schemas.openxmlformats.org/drawingml/2006/picture">
+                  <pic:nvPicPr>
+                    <pic:cNvPr id="1001" name="Figure1"/>
+                    <pic:cNvPicPr/>
+                  </pic:nvPicPr>
+                  <pic:blipFill>
+                    <a:blip r:embed="rIdImg1"/>
+                    <a:stretch>
+                      <a:fillRect/>
+                    </a:stretch>
+                  </pic:blipFill>
+                  <pic:spPr>
+                    <a:xfrm>
+                      <a:off x="0" y="0"/>
+                      <a:ext cx="5760720" cy="3064212"/>
+                    </a:xfrm>
+                    <a:prstGeom prst="rect">
+                      <a:avLst/>
+                    </a:prstGeom>
+                  </pic:spPr>
+                </pic:pic>
+              </a:graphicData>
+            </a:graphic>
+          </wp:inline>
+        </w:drawing>
       </w:r>
     </w:p>
     <w:p/>
@@ -330,11 +365,46 @@
     </w:p>
     <w:p/>
     <w:p>
-      <w:r>
-        <w:rPr>
-          <w:b/>
-        </w:rPr>
-        <w:t xml:space="preserve">[Figure 2 near here.]</w:t>
+      <w:pPr>
+        <w:jc w:val="center"/>
+        <w:spacing w:before="120" w:after="60"/>
+      </w:pPr>
+      <w:r>
+        <w:drawing>
+          <wp:inline xmlns:wp="http://schemas.openxmlformats.org/drawingml/2006/wordprocessingDrawing" distT="0" distB="0" distL="0" distR="0">
+            <wp:extent cx="5760720" cy="3200400"/>
+            <wp:effectExtent l="0" t="0" r="0" b="0"/>
+            <wp:docPr id="1002" name="Figure2"/>
+            <wp:cNvGraphicFramePr>
+              <a:graphicFrameLocks xmlns:a="http://schemas.openxmlformats.org/drawingml/2006/main" noChangeAspect="1"/>
+            </wp:cNvGraphicFramePr>
+            <a:graphic xmlns:a="http://schemas.openxmlformats.org/drawingml/2006/main">
+              <a:graphicData uri="http://schemas.openxmlformats.org/drawingml/2006/picture">
+                <pic:pic xmlns:pic="http://schemas.openxmlformats.org/drawingml/2006/picture">
+                  <pic:nvPicPr>
+                    <pic:cNvPr id="1002" name="Figure2"/>
+                    <pic:cNvPicPr/>
+                  </pic:nvPicPr>
+                  <pic:blipFill>
+                    <a:blip r:embed="rIdImg2"/>
+                    <a:stretch>
+                      <a:fillRect/>
+                    </a:stretch>
+                  </pic:blipFill>
+                  <pic:spPr>
+                    <a:xfrm>
+                      <a:off x="0" y="0"/>
+                      <a:ext cx="5760720" cy="3200400"/>
+                    </a:xfrm>
+                    <a:prstGeom prst="rect">
+                      <a:avLst/>
+                    </a:prstGeom>
+                  </pic:spPr>
+                </pic:pic>
+              </a:graphicData>
+            </a:graphic>
+          </wp:inline>
+        </w:drawing>
       </w:r>
     </w:p>
     <w:p/>
@@ -420,11 +490,46 @@
     </w:p>
     <w:p/>
     <w:p>
-      <w:r>
-        <w:rPr>
-          <w:b/>
-        </w:rPr>
-        <w:t xml:space="preserve">[Figure 3 near here.]</w:t>
+      <w:pPr>
+        <w:jc w:val="center"/>
+        <w:spacing w:before="120" w:after="60"/>
+      </w:pPr>
+      <w:r>
+        <w:drawing>
+          <wp:inline xmlns:wp="http://schemas.openxmlformats.org/drawingml/2006/wordprocessingDrawing" distT="0" distB="0" distL="0" distR="0">
+            <wp:extent cx="5760720" cy="3789947"/>
+            <wp:effectExtent l="0" t="0" r="0" b="0"/>
+            <wp:docPr id="1003" name="Figure3"/>
+            <wp:cNvGraphicFramePr>
+              <a:graphicFrameLocks xmlns:a="http://schemas.openxmlformats.org/drawingml/2006/main" noChangeAspect="1"/>
+            </wp:cNvGraphicFramePr>
+            <a:graphic xmlns:a="http://schemas.openxmlformats.org/drawingml/2006/main">
+              <a:graphicData uri="http://schemas.openxmlformats.org/drawingml/2006/picture">
+                <pic:pic xmlns:pic="http://schemas.openxmlformats.org/drawingml/2006/picture">
+                  <pic:nvPicPr>
+                    <pic:cNvPr id="1003" name="Figure3"/>
+                    <pic:cNvPicPr/>
+                  </pic:nvPicPr>
+                  <pic:blipFill>
+                    <a:blip r:embed="rIdImg3"/>
+                    <a:stretch>
+                      <a:fillRect/>
+                    </a:stretch>
+                  </pic:blipFill>
+                  <pic:spPr>
+                    <a:xfrm>
+                      <a:off x="0" y="0"/>
+                      <a:ext cx="5760720" cy="3789947"/>
+                    </a:xfrm>
+                    <a:prstGeom prst="rect">
+                      <a:avLst/>
+                    </a:prstGeom>
+                  </pic:spPr>
+                </pic:pic>
+              </a:graphicData>
+            </a:graphic>
+          </wp:inline>
+        </w:drawing>
       </w:r>
     </w:p>
     <w:p/>
@@ -799,11 +904,46 @@
     </w:p>
     <w:p/>
     <w:p>
-      <w:r>
-        <w:rPr>
-          <w:b/>
-        </w:rPr>
-        <w:t xml:space="preserve">[Figure 4 near here.]</w:t>
+      <w:pPr>
+        <w:jc w:val="center"/>
+        <w:spacing w:before="120" w:after="60"/>
+      </w:pPr>
+      <w:r>
+        <w:drawing>
+          <wp:inline xmlns:wp="http://schemas.openxmlformats.org/drawingml/2006/wordprocessingDrawing" distT="0" distB="0" distL="0" distR="0">
+            <wp:extent cx="5760720" cy="2704011"/>
+            <wp:effectExtent l="0" t="0" r="0" b="0"/>
+            <wp:docPr id="1004" name="Figure4"/>
+            <wp:cNvGraphicFramePr>
+              <a:graphicFrameLocks xmlns:a="http://schemas.openxmlformats.org/drawingml/2006/main" noChangeAspect="1"/>
+            </wp:cNvGraphicFramePr>
+            <a:graphic xmlns:a="http://schemas.openxmlformats.org/drawingml/2006/main">
+              <a:graphicData uri="http://schemas.openxmlformats.org/drawingml/2006/picture">
+                <pic:pic xmlns:pic="http://schemas.openxmlformats.org/drawingml/2006/picture">
+                  <pic:nvPicPr>
+                    <pic:cNvPr id="1004" name="Figure4"/>
+                    <pic:cNvPicPr/>
+                  </pic:nvPicPr>
+                  <pic:blipFill>
+                    <a:blip r:embed="rIdImg4"/>
+                    <a:stretch>
+                      <a:fillRect/>
+                    </a:stretch>
+                  </pic:blipFill>
+                  <pic:spPr>
+                    <a:xfrm>
+                      <a:off x="0" y="0"/>
+                      <a:ext cx="5760720" cy="2704011"/>
+                    </a:xfrm>
+                    <a:prstGeom prst="rect">
+                      <a:avLst/>
+                    </a:prstGeom>
+                  </pic:spPr>
+                </pic:pic>
+              </a:graphicData>
+            </a:graphic>
+          </wp:inline>
+        </w:drawing>
       </w:r>
     </w:p>
     <w:p/>
@@ -834,11 +974,46 @@
     </w:p>
     <w:p/>
     <w:p>
-      <w:r>
-        <w:rPr>
-          <w:b/>
-        </w:rPr>
-        <w:t xml:space="preserve">[Figure 5 near here.]</w:t>
+      <w:pPr>
+        <w:jc w:val="center"/>
+        <w:spacing w:before="120" w:after="60"/>
+      </w:pPr>
+      <w:r>
+        <w:drawing>
+          <wp:inline xmlns:wp="http://schemas.openxmlformats.org/drawingml/2006/wordprocessingDrawing" distT="0" distB="0" distL="0" distR="0">
+            <wp:extent cx="5760720" cy="2704011"/>
+            <wp:effectExtent l="0" t="0" r="0" b="0"/>
+            <wp:docPr id="1005" name="Figure5"/>
+            <wp:cNvGraphicFramePr>
+              <a:graphicFrameLocks xmlns:a="http://schemas.openxmlformats.org/drawingml/2006/main" noChangeAspect="1"/>
+            </wp:cNvGraphicFramePr>
+            <a:graphic xmlns:a="http://schemas.openxmlformats.org/drawingml/2006/main">
+              <a:graphicData uri="http://schemas.openxmlformats.org/drawingml/2006/picture">
+                <pic:pic xmlns:pic="http://schemas.openxmlformats.org/drawingml/2006/picture">
+                  <pic:nvPicPr>
+                    <pic:cNvPr id="1005" name="Figure5"/>
+                    <pic:cNvPicPr/>
+                  </pic:nvPicPr>
+                  <pic:blipFill>
+                    <a:blip r:embed="rIdImg5"/>
+                    <a:stretch>
+                      <a:fillRect/>
+                    </a:stretch>
+                  </pic:blipFill>
+                  <pic:spPr>
+                    <a:xfrm>
+                      <a:off x="0" y="0"/>
+                      <a:ext cx="5760720" cy="2704011"/>
+                    </a:xfrm>
+                    <a:prstGeom prst="rect">
+                      <a:avLst/>
+                    </a:prstGeom>
+                  </pic:spPr>
+                </pic:pic>
+              </a:graphicData>
+            </a:graphic>
+          </wp:inline>
+        </w:drawing>
       </w:r>
     </w:p>
     <w:p/>
@@ -863,11 +1038,46 @@
     </w:p>
     <w:p/>
     <w:p>
-      <w:r>
-        <w:rPr>
-          <w:b/>
-        </w:rPr>
-        <w:t xml:space="preserve">[Figure 6 near here.]</w:t>
+      <w:pPr>
+        <w:jc w:val="center"/>
+        <w:spacing w:before="120" w:after="60"/>
+      </w:pPr>
+      <w:r>
+        <w:drawing>
+          <wp:inline xmlns:wp="http://schemas.openxmlformats.org/drawingml/2006/wordprocessingDrawing" distT="0" distB="0" distL="0" distR="0">
+            <wp:extent cx="5760720" cy="2704011"/>
+            <wp:effectExtent l="0" t="0" r="0" b="0"/>
+            <wp:docPr id="1006" name="Figure6"/>
+            <wp:cNvGraphicFramePr>
+              <a:graphicFrameLocks xmlns:a="http://schemas.openxmlformats.org/drawingml/2006/main" noChangeAspect="1"/>
+            </wp:cNvGraphicFramePr>
+            <a:graphic xmlns:a="http://schemas.openxmlformats.org/drawingml/2006/main">
+              <a:graphicData uri="http://schemas.openxmlformats.org/drawingml/2006/picture">
+                <pic:pic xmlns:pic="http://schemas.openxmlformats.org/drawingml/2006/picture">
+                  <pic:nvPicPr>
+                    <pic:cNvPr id="1006" name="Figure6"/>
+                    <pic:cNvPicPr/>
+                  </pic:nvPicPr>
+                  <pic:blipFill>
+                    <a:blip r:embed="rIdImg6"/>
+                    <a:stretch>
+                      <a:fillRect/>
+                    </a:stretch>
+                  </pic:blipFill>
+                  <pic:spPr>
+                    <a:xfrm>
+                      <a:off x="0" y="0"/>
+                      <a:ext cx="5760720" cy="2704011"/>
+                    </a:xfrm>
+                    <a:prstGeom prst="rect">
+                      <a:avLst/>
+                    </a:prstGeom>
+                  </pic:spPr>
+                </pic:pic>
+              </a:graphicData>
+            </a:graphic>
+          </wp:inline>
+        </w:drawing>
       </w:r>
     </w:p>
     <w:p/>
@@ -921,11 +1131,46 @@
     </w:p>
     <w:p/>
     <w:p>
-      <w:r>
-        <w:rPr>
-          <w:b/>
-        </w:rPr>
-        <w:t xml:space="preserve">[Figure 7 near here.]</w:t>
+      <w:pPr>
+        <w:jc w:val="center"/>
+        <w:spacing w:before="120" w:after="60"/>
+      </w:pPr>
+      <w:r>
+        <w:drawing>
+          <wp:inline xmlns:wp="http://schemas.openxmlformats.org/drawingml/2006/wordprocessingDrawing" distT="0" distB="0" distL="0" distR="0">
+            <wp:extent cx="5760720" cy="3328416"/>
+            <wp:effectExtent l="0" t="0" r="0" b="0"/>
+            <wp:docPr id="1007" name="Figure7"/>
+            <wp:cNvGraphicFramePr>
+              <a:graphicFrameLocks xmlns:a="http://schemas.openxmlformats.org/drawingml/2006/main" noChangeAspect="1"/>
+            </wp:cNvGraphicFramePr>
+            <a:graphic xmlns:a="http://schemas.openxmlformats.org/drawingml/2006/main">
+              <a:graphicData uri="http://schemas.openxmlformats.org/drawingml/2006/picture">
+                <pic:pic xmlns:pic="http://schemas.openxmlformats.org/drawingml/2006/picture">
+                  <pic:nvPicPr>
+                    <pic:cNvPr id="1007" name="Figure7"/>
+                    <pic:cNvPicPr/>
+                  </pic:nvPicPr>
+                  <pic:blipFill>
+                    <a:blip r:embed="rIdImg7"/>
+                    <a:stretch>
+                      <a:fillRect/>
+                    </a:stretch>
+                  </pic:blipFill>
+                  <pic:spPr>
+                    <a:xfrm>
+                      <a:off x="0" y="0"/>
+                      <a:ext cx="5760720" cy="3328416"/>
+                    </a:xfrm>
+                    <a:prstGeom prst="rect">
+                      <a:avLst/>
+                    </a:prstGeom>
+                  </pic:spPr>
+                </pic:pic>
+              </a:graphicData>
+            </a:graphic>
+          </wp:inline>
+        </w:drawing>
       </w:r>
     </w:p>
     <w:p/>

</xml_diff>